<commit_message>
Se completa acrchivo, a la espera de la aprobación del docente para subirlo a la plataforma.
</commit_message>
<xml_diff>
--- a/Fase 1/Evidencias Individuales/Pino_Joselyn_1.1_APT122_AutoevaluacionCompetenciasFase1.docx
+++ b/Fase 1/Evidencias Individuales/Pino_Joselyn_1.1_APT122_AutoevaluacionCompetenciasFase1.docx
@@ -1319,164 +1319,8 @@
           <w:between w:space="0" w:sz="0" w:val="nil"/>
         </w:pBdr>
         <w:shd w:fill="auto" w:val="clear"/>
-        <w:spacing w:after="0" w:before="0" w:line="259" w:lineRule="auto"/>
-        <w:ind w:left="435" w:right="0" w:firstLine="0"/>
-        <w:jc w:val="both"/>
-        <w:rPr>
-          <w:rFonts w:ascii="Calibri" w:cs="Calibri" w:eastAsia="Calibri" w:hAnsi="Calibri"/>
-          <w:b w:val="0"/>
-          <w:bCs w:val="0"/>
-          <w:i w:val="0"/>
-          <w:iCs w:val="0"/>
-          <w:smallCaps w:val="0"/>
-          <w:strike w:val="0"/>
-          <w:color w:val="000000"/>
-          <w:sz w:val="24"/>
-          <w:szCs w:val="24"/>
-          <w:u w:val="none"/>
-          <w:shd w:fill="auto" w:val="clear"/>
-          <w:vertAlign w:val="baseline"/>
-        </w:rPr>
-      </w:pPr>
-      <w:r>
-        <w:rPr>
-          <w:rtl w:val="0"/>
-        </w:rPr>
-      </w:r>
-    </w:p>
-    <w:p>
-      <w:pPr>
-        <w:keepNext w:val="0"/>
-        <w:keepLines w:val="0"/>
-        <w:pageBreakBefore w:val="0"/>
-        <w:widowControl w:val="1"/>
-        <w:pBdr>
-          <w:top w:space="0" w:sz="0" w:val="nil"/>
-          <w:left w:space="0" w:sz="0" w:val="nil"/>
-          <w:bottom w:space="0" w:sz="0" w:val="nil"/>
-          <w:right w:space="0" w:sz="0" w:val="nil"/>
-          <w:between w:space="0" w:sz="0" w:val="nil"/>
-        </w:pBdr>
-        <w:shd w:fill="auto" w:val="clear"/>
-        <w:spacing w:after="0" w:before="0" w:line="259" w:lineRule="auto"/>
-        <w:ind w:left="435" w:right="0" w:firstLine="0"/>
-        <w:jc w:val="both"/>
-        <w:rPr>
-          <w:rFonts w:ascii="Calibri" w:cs="Calibri" w:eastAsia="Calibri" w:hAnsi="Calibri"/>
-          <w:b w:val="0"/>
-          <w:bCs w:val="0"/>
-          <w:i w:val="0"/>
-          <w:iCs w:val="0"/>
-          <w:smallCaps w:val="0"/>
-          <w:strike w:val="0"/>
-          <w:color w:val="000000"/>
-          <w:sz w:val="24"/>
-          <w:szCs w:val="24"/>
-          <w:u w:val="none"/>
-          <w:shd w:fill="auto" w:val="clear"/>
-          <w:vertAlign w:val="baseline"/>
-        </w:rPr>
-      </w:pPr>
-      <w:r>
-        <w:rPr>
-          <w:rtl w:val="0"/>
-        </w:rPr>
-      </w:r>
-    </w:p>
-    <w:p>
-      <w:pPr>
-        <w:keepNext w:val="0"/>
-        <w:keepLines w:val="0"/>
-        <w:pageBreakBefore w:val="0"/>
-        <w:widowControl w:val="1"/>
-        <w:pBdr>
-          <w:top w:space="0" w:sz="0" w:val="nil"/>
-          <w:left w:space="0" w:sz="0" w:val="nil"/>
-          <w:bottom w:space="0" w:sz="0" w:val="nil"/>
-          <w:right w:space="0" w:sz="0" w:val="nil"/>
-          <w:between w:space="0" w:sz="0" w:val="nil"/>
-        </w:pBdr>
-        <w:shd w:fill="auto" w:val="clear"/>
-        <w:spacing w:after="0" w:before="0" w:line="259" w:lineRule="auto"/>
-        <w:ind w:left="435" w:right="0" w:firstLine="0"/>
-        <w:jc w:val="both"/>
-        <w:rPr>
-          <w:rFonts w:ascii="Calibri" w:cs="Calibri" w:eastAsia="Calibri" w:hAnsi="Calibri"/>
-          <w:b w:val="0"/>
-          <w:bCs w:val="0"/>
-          <w:i w:val="0"/>
-          <w:iCs w:val="0"/>
-          <w:smallCaps w:val="0"/>
-          <w:strike w:val="0"/>
-          <w:color w:val="000000"/>
-          <w:sz w:val="24"/>
-          <w:szCs w:val="24"/>
-          <w:u w:val="none"/>
-          <w:shd w:fill="auto" w:val="clear"/>
-          <w:vertAlign w:val="baseline"/>
-        </w:rPr>
-      </w:pPr>
-      <w:r>
-        <w:rPr>
-          <w:rtl w:val="0"/>
-        </w:rPr>
-      </w:r>
-    </w:p>
-    <w:p>
-      <w:pPr>
-        <w:keepNext w:val="0"/>
-        <w:keepLines w:val="0"/>
-        <w:pageBreakBefore w:val="0"/>
-        <w:widowControl w:val="1"/>
-        <w:pBdr>
-          <w:top w:space="0" w:sz="0" w:val="nil"/>
-          <w:left w:space="0" w:sz="0" w:val="nil"/>
-          <w:bottom w:space="0" w:sz="0" w:val="nil"/>
-          <w:right w:space="0" w:sz="0" w:val="nil"/>
-          <w:between w:space="0" w:sz="0" w:val="nil"/>
-        </w:pBdr>
-        <w:shd w:fill="auto" w:val="clear"/>
-        <w:spacing w:after="0" w:before="0" w:line="259" w:lineRule="auto"/>
-        <w:ind w:left="435" w:right="0" w:firstLine="0"/>
-        <w:jc w:val="both"/>
-        <w:rPr>
-          <w:rFonts w:ascii="Calibri" w:cs="Calibri" w:eastAsia="Calibri" w:hAnsi="Calibri"/>
-          <w:b w:val="0"/>
-          <w:bCs w:val="0"/>
-          <w:i w:val="0"/>
-          <w:iCs w:val="0"/>
-          <w:smallCaps w:val="0"/>
-          <w:strike w:val="0"/>
-          <w:color w:val="767171"/>
-          <w:sz w:val="24"/>
-          <w:szCs w:val="24"/>
-          <w:u w:val="none"/>
-          <w:shd w:fill="auto" w:val="clear"/>
-          <w:vertAlign w:val="baseline"/>
-        </w:rPr>
-      </w:pPr>
-      <w:r>
-        <w:rPr>
-          <w:rtl w:val="0"/>
-        </w:rPr>
-      </w:r>
-    </w:p>
-    <w:p>
-      <w:pPr>
-        <w:keepNext w:val="0"/>
-        <w:keepLines w:val="0"/>
-        <w:pageBreakBefore w:val="0"/>
-        <w:widowControl w:val="1"/>
-        <w:pBdr>
-          <w:top w:space="0" w:sz="0" w:val="nil"/>
-          <w:left w:space="0" w:sz="0" w:val="nil"/>
-          <w:bottom w:space="0" w:sz="0" w:val="nil"/>
-          <w:right w:space="0" w:sz="0" w:val="nil"/>
-          <w:between w:space="0" w:sz="0" w:val="nil"/>
-        </w:pBdr>
-        <w:shd w:fill="auto" w:val="clear"/>
         <w:spacing w:after="160" w:before="0" w:line="259" w:lineRule="auto"/>
-        <w:ind w:left="435" w:right="0" w:firstLine="0"/>
+        <w:ind w:left="0" w:right="0" w:firstLine="0"/>
         <w:jc w:val="both"/>
         <w:rPr>
           <w:rFonts w:ascii="Calibri" w:cs="Calibri" w:eastAsia="Calibri" w:hAnsi="Calibri"/>
@@ -1964,86 +1808,8 @@
           <w:between w:space="0" w:sz="0" w:val="nil"/>
         </w:pBdr>
         <w:shd w:fill="auto" w:val="clear"/>
-        <w:spacing w:after="0" w:before="0" w:line="259" w:lineRule="auto"/>
-        <w:ind w:left="435" w:right="0" w:firstLine="0"/>
-        <w:jc w:val="both"/>
-        <w:rPr>
-          <w:rFonts w:ascii="Calibri" w:cs="Calibri" w:eastAsia="Calibri" w:hAnsi="Calibri"/>
-          <w:b w:val="0"/>
-          <w:bCs w:val="0"/>
-          <w:i w:val="0"/>
-          <w:iCs w:val="0"/>
-          <w:smallCaps w:val="0"/>
-          <w:strike w:val="0"/>
-          <w:color w:val="767171"/>
-          <w:sz w:val="24"/>
-          <w:szCs w:val="24"/>
-          <w:u w:val="none"/>
-          <w:shd w:fill="auto" w:val="clear"/>
-          <w:vertAlign w:val="baseline"/>
-        </w:rPr>
-      </w:pPr>
-      <w:r>
-        <w:rPr>
-          <w:rtl w:val="0"/>
-        </w:rPr>
-      </w:r>
-    </w:p>
-    <w:p>
-      <w:pPr>
-        <w:keepNext w:val="0"/>
-        <w:keepLines w:val="0"/>
-        <w:pageBreakBefore w:val="0"/>
-        <w:widowControl w:val="1"/>
-        <w:pBdr>
-          <w:top w:space="0" w:sz="0" w:val="nil"/>
-          <w:left w:space="0" w:sz="0" w:val="nil"/>
-          <w:bottom w:space="0" w:sz="0" w:val="nil"/>
-          <w:right w:space="0" w:sz="0" w:val="nil"/>
-          <w:between w:space="0" w:sz="0" w:val="nil"/>
-        </w:pBdr>
-        <w:shd w:fill="auto" w:val="clear"/>
-        <w:spacing w:after="0" w:before="0" w:line="259" w:lineRule="auto"/>
-        <w:ind w:left="435" w:right="0" w:firstLine="0"/>
-        <w:jc w:val="both"/>
-        <w:rPr>
-          <w:rFonts w:ascii="Calibri" w:cs="Calibri" w:eastAsia="Calibri" w:hAnsi="Calibri"/>
-          <w:b w:val="0"/>
-          <w:bCs w:val="0"/>
-          <w:i w:val="0"/>
-          <w:iCs w:val="0"/>
-          <w:smallCaps w:val="0"/>
-          <w:strike w:val="0"/>
-          <w:color w:val="767171"/>
-          <w:sz w:val="24"/>
-          <w:szCs w:val="24"/>
-          <w:u w:val="none"/>
-          <w:shd w:fill="auto" w:val="clear"/>
-          <w:vertAlign w:val="baseline"/>
-        </w:rPr>
-      </w:pPr>
-      <w:r>
-        <w:rPr>
-          <w:rtl w:val="0"/>
-        </w:rPr>
-      </w:r>
-    </w:p>
-    <w:p>
-      <w:pPr>
-        <w:keepNext w:val="0"/>
-        <w:keepLines w:val="0"/>
-        <w:pageBreakBefore w:val="0"/>
-        <w:widowControl w:val="1"/>
-        <w:pBdr>
-          <w:top w:space="0" w:sz="0" w:val="nil"/>
-          <w:left w:space="0" w:sz="0" w:val="nil"/>
-          <w:bottom w:space="0" w:sz="0" w:val="nil"/>
-          <w:right w:space="0" w:sz="0" w:val="nil"/>
-          <w:between w:space="0" w:sz="0" w:val="nil"/>
-        </w:pBdr>
-        <w:shd w:fill="auto" w:val="clear"/>
         <w:spacing w:after="160" w:before="0" w:line="259" w:lineRule="auto"/>
-        <w:ind w:left="435" w:right="0" w:firstLine="0"/>
+        <w:ind w:left="0" w:right="0" w:firstLine="0"/>
         <w:jc w:val="left"/>
         <w:rPr>
           <w:rFonts w:ascii="Calibri" w:cs="Calibri" w:eastAsia="Calibri" w:hAnsi="Calibri"/>
@@ -2411,11 +2177,33 @@
           <w:tcPr/>
           <w:p>
             <w:pPr>
+              <w:pBdr>
+                <w:top w:color="auto" w:space="7" w:sz="0" w:val="none"/>
+                <w:bottom w:color="auto" w:space="7" w:sz="0" w:val="none"/>
+                <w:right w:color="auto" w:space="7" w:sz="0" w:val="none"/>
+                <w:between w:color="auto" w:space="7" w:sz="0" w:val="none"/>
+              </w:pBdr>
+              <w:shd w:fill="ffffff" w:val="clear"/>
+              <w:spacing w:before="180" w:lineRule="auto"/>
+              <w:ind w:left="0" w:firstLine="0"/>
+              <w:rPr>
+                <w:sz w:val="18"/>
+                <w:szCs w:val="18"/>
+              </w:rPr>
+            </w:pPr>
+            <w:r>
+              <w:rPr>
+                <w:sz w:val="18"/>
+                <w:szCs w:val="18"/>
+                <w:rtl w:val="0"/>
+              </w:rPr>
+              <w:t xml:space="preserve">Diseñar y generar soluciones de software innovadoras y de calidad, aplicando el ciclo de vida de éste, según las características del proyecto, las mejores prácticas de la industria y sus estándares de calidad.</w:t>
+            </w:r>
+          </w:p>
+          <w:p>
+            <w:pPr>
               <w:jc w:val="center"/>
               <w:rPr>
-                <w:b w:val="1"/>
-                <w:bCs w:val="1"/>
-                <w:color w:val="ff0000"/>
                 <w:sz w:val="18"/>
                 <w:szCs w:val="18"/>
               </w:rPr>
@@ -2460,8 +2248,13 @@
             </w:pPr>
             <w:r>
               <w:rPr>
-                <w:rtl w:val="0"/>
-              </w:rPr>
+                <w:b w:val="1"/>
+                <w:bCs w:val="1"/>
+                <w:sz w:val="18"/>
+                <w:szCs w:val="18"/>
+                <w:rtl w:val="0"/>
+              </w:rPr>
+              <w:t xml:space="preserve">X</w:t>
             </w:r>
           </w:p>
         </w:tc>
@@ -2526,18 +2319,22 @@
           <w:tcPr/>
           <w:p>
             <w:pPr>
-              <w:jc w:val="center"/>
-              <w:rPr>
-                <w:b w:val="1"/>
-                <w:bCs w:val="1"/>
-                <w:sz w:val="18"/>
-                <w:szCs w:val="18"/>
-              </w:rPr>
-            </w:pPr>
-            <w:r>
-              <w:rPr>
-                <w:rtl w:val="0"/>
-              </w:rPr>
+              <w:rPr>
+                <w:b w:val="1"/>
+                <w:bCs w:val="1"/>
+                <w:sz w:val="18"/>
+                <w:szCs w:val="18"/>
+              </w:rPr>
+            </w:pPr>
+            <w:r>
+              <w:rPr>
+                <w:b w:val="1"/>
+                <w:bCs w:val="1"/>
+                <w:sz w:val="18"/>
+                <w:szCs w:val="18"/>
+                <w:rtl w:val="0"/>
+              </w:rPr>
+              <w:t xml:space="preserve">Siento que he logrado demostrar mi dominio en el diseño de soluciones y propuestas innovadoras, pero es necesario reforzar con las nuevas herramientas que siguen apareciendo en la industria. Actualmente el crecimiento y uso de la IA va muy rápido, por lo que se debe ser constante con el aprendizaje y la evolución de ella.</w:t>
             </w:r>
           </w:p>
         </w:tc>
@@ -2552,11 +2349,33 @@
           <w:tcPr/>
           <w:p>
             <w:pPr>
+              <w:pBdr>
+                <w:top w:color="auto" w:space="7" w:sz="0" w:val="none"/>
+                <w:bottom w:color="auto" w:space="7" w:sz="0" w:val="none"/>
+                <w:right w:color="auto" w:space="7" w:sz="0" w:val="none"/>
+                <w:between w:color="auto" w:space="7" w:sz="0" w:val="none"/>
+              </w:pBdr>
+              <w:shd w:fill="ffffff" w:val="clear"/>
+              <w:spacing w:before="180" w:lineRule="auto"/>
+              <w:ind w:left="0" w:firstLine="0"/>
+              <w:rPr>
+                <w:sz w:val="18"/>
+                <w:szCs w:val="18"/>
+              </w:rPr>
+            </w:pPr>
+            <w:r>
+              <w:rPr>
+                <w:sz w:val="18"/>
+                <w:szCs w:val="18"/>
+                <w:rtl w:val="0"/>
+              </w:rPr>
+              <w:t xml:space="preserve">Diseñar y generar soluciones que permitan resolver los requerimientos de información en el contexto de las organizaciones, considerando bases de datos relacionales y no relacionales.</w:t>
+            </w:r>
+          </w:p>
+          <w:p>
+            <w:pPr>
               <w:jc w:val="center"/>
               <w:rPr>
-                <w:b w:val="1"/>
-                <w:bCs w:val="1"/>
-                <w:color w:val="ff0000"/>
                 <w:sz w:val="18"/>
                 <w:szCs w:val="18"/>
               </w:rPr>
@@ -2601,8 +2420,13 @@
             </w:pPr>
             <w:r>
               <w:rPr>
-                <w:rtl w:val="0"/>
-              </w:rPr>
+                <w:b w:val="1"/>
+                <w:bCs w:val="1"/>
+                <w:sz w:val="18"/>
+                <w:szCs w:val="18"/>
+                <w:rtl w:val="0"/>
+              </w:rPr>
+              <w:t xml:space="preserve">X</w:t>
             </w:r>
           </w:p>
         </w:tc>
@@ -2667,18 +2491,42 @@
           <w:tcPr/>
           <w:p>
             <w:pPr>
-              <w:jc w:val="center"/>
-              <w:rPr>
-                <w:b w:val="1"/>
-                <w:bCs w:val="1"/>
-                <w:sz w:val="18"/>
-                <w:szCs w:val="18"/>
-              </w:rPr>
-            </w:pPr>
-            <w:r>
-              <w:rPr>
-                <w:rtl w:val="0"/>
-              </w:rPr>
+              <w:rPr>
+                <w:b w:val="1"/>
+                <w:bCs w:val="1"/>
+                <w:sz w:val="18"/>
+                <w:szCs w:val="18"/>
+              </w:rPr>
+            </w:pPr>
+            <w:r>
+              <w:rPr>
+                <w:b w:val="1"/>
+                <w:bCs w:val="1"/>
+                <w:sz w:val="18"/>
+                <w:szCs w:val="18"/>
+                <w:rtl w:val="0"/>
+              </w:rPr>
+              <w:t xml:space="preserve">Siento que he logrado demostrar mi dominio en el diseño de soluciones y propuestas que resuelven problemas cotidianos.</w:t>
+            </w:r>
+          </w:p>
+          <w:p>
+            <w:pPr>
+              <w:rPr>
+                <w:b w:val="1"/>
+                <w:bCs w:val="1"/>
+                <w:sz w:val="18"/>
+                <w:szCs w:val="18"/>
+              </w:rPr>
+            </w:pPr>
+            <w:r>
+              <w:rPr>
+                <w:b w:val="1"/>
+                <w:bCs w:val="1"/>
+                <w:sz w:val="18"/>
+                <w:szCs w:val="18"/>
+                <w:rtl w:val="0"/>
+              </w:rPr>
+              <w:t xml:space="preserve">Cuento con un alto nivel de dominio en el uso de base de datos desde sql a crear querys en dashboard como PowerBI y Data Studio.</w:t>
             </w:r>
           </w:p>
         </w:tc>
@@ -2693,10 +2541,33 @@
           <w:tcPr/>
           <w:p>
             <w:pPr>
+              <w:pBdr>
+                <w:top w:color="auto" w:space="7" w:sz="0" w:val="none"/>
+                <w:bottom w:color="auto" w:space="7" w:sz="0" w:val="none"/>
+                <w:right w:color="auto" w:space="7" w:sz="0" w:val="none"/>
+                <w:between w:color="auto" w:space="7" w:sz="0" w:val="none"/>
+              </w:pBdr>
+              <w:shd w:fill="ffffff" w:val="clear"/>
+              <w:spacing w:before="180" w:lineRule="auto"/>
+              <w:ind w:left="0" w:firstLine="0"/>
+              <w:rPr>
+                <w:sz w:val="18"/>
+                <w:szCs w:val="18"/>
+              </w:rPr>
+            </w:pPr>
+            <w:r>
+              <w:rPr>
+                <w:sz w:val="18"/>
+                <w:szCs w:val="18"/>
+                <w:rtl w:val="0"/>
+              </w:rPr>
+              <w:t xml:space="preserve">Diseñar y adaptar los procesos de ingeniería de requisitos, a través del uso de metodologías de vanguardia y estándares de la industria, para el desarrollo de soluciones TI complejas, innovadoras y de calidad.</w:t>
+            </w:r>
+          </w:p>
+          <w:p>
+            <w:pPr>
               <w:jc w:val="center"/>
               <w:rPr>
-                <w:b w:val="1"/>
-                <w:bCs w:val="1"/>
                 <w:sz w:val="18"/>
                 <w:szCs w:val="18"/>
               </w:rPr>
@@ -2741,8 +2612,13 @@
             </w:pPr>
             <w:r>
               <w:rPr>
-                <w:rtl w:val="0"/>
-              </w:rPr>
+                <w:b w:val="1"/>
+                <w:bCs w:val="1"/>
+                <w:sz w:val="18"/>
+                <w:szCs w:val="18"/>
+                <w:rtl w:val="0"/>
+              </w:rPr>
+              <w:t xml:space="preserve">X</w:t>
             </w:r>
           </w:p>
         </w:tc>
@@ -2807,18 +2683,22 @@
           <w:tcPr/>
           <w:p>
             <w:pPr>
-              <w:jc w:val="center"/>
-              <w:rPr>
-                <w:b w:val="1"/>
-                <w:bCs w:val="1"/>
-                <w:sz w:val="18"/>
-                <w:szCs w:val="18"/>
-              </w:rPr>
-            </w:pPr>
-            <w:r>
-              <w:rPr>
-                <w:rtl w:val="0"/>
-              </w:rPr>
+              <w:rPr>
+                <w:b w:val="1"/>
+                <w:bCs w:val="1"/>
+                <w:sz w:val="18"/>
+                <w:szCs w:val="18"/>
+              </w:rPr>
+            </w:pPr>
+            <w:r>
+              <w:rPr>
+                <w:b w:val="1"/>
+                <w:bCs w:val="1"/>
+                <w:sz w:val="18"/>
+                <w:szCs w:val="18"/>
+                <w:rtl w:val="0"/>
+              </w:rPr>
+              <w:t xml:space="preserve">Siento que cuento con un nivel alto en el dominio para diseñar, adaptar y mejorar procesos en distintas áreas y empresas, siguiendo los estándares y normativas actuales.</w:t>
             </w:r>
           </w:p>
         </w:tc>
@@ -2833,10 +2713,33 @@
           <w:tcPr/>
           <w:p>
             <w:pPr>
+              <w:pBdr>
+                <w:top w:color="auto" w:space="7" w:sz="0" w:val="none"/>
+                <w:bottom w:color="auto" w:space="7" w:sz="0" w:val="none"/>
+                <w:right w:color="auto" w:space="7" w:sz="0" w:val="none"/>
+                <w:between w:color="auto" w:space="7" w:sz="0" w:val="none"/>
+              </w:pBdr>
+              <w:shd w:fill="ffffff" w:val="clear"/>
+              <w:spacing w:before="180" w:lineRule="auto"/>
+              <w:ind w:left="0" w:firstLine="0"/>
+              <w:rPr>
+                <w:sz w:val="18"/>
+                <w:szCs w:val="18"/>
+              </w:rPr>
+            </w:pPr>
+            <w:r>
+              <w:rPr>
+                <w:sz w:val="18"/>
+                <w:szCs w:val="18"/>
+                <w:rtl w:val="0"/>
+              </w:rPr>
+              <w:t xml:space="preserve">Evaluar y gestionar proyectos en su área de especialización profesional, durante todo el ciclo de vida, de acuerdo a buenas prácticas y utilizando metodologías y herramientas de software, para cumplir con los requerimientos de la organización en contextos tradicionales y ágiles.</w:t>
+            </w:r>
+          </w:p>
+          <w:p>
+            <w:pPr>
               <w:jc w:val="center"/>
               <w:rPr>
-                <w:b w:val="1"/>
-                <w:bCs w:val="1"/>
                 <w:sz w:val="18"/>
                 <w:szCs w:val="18"/>
               </w:rPr>
@@ -2881,8 +2784,13 @@
             </w:pPr>
             <w:r>
               <w:rPr>
-                <w:rtl w:val="0"/>
-              </w:rPr>
+                <w:b w:val="1"/>
+                <w:bCs w:val="1"/>
+                <w:sz w:val="18"/>
+                <w:szCs w:val="18"/>
+                <w:rtl w:val="0"/>
+              </w:rPr>
+              <w:t xml:space="preserve">X</w:t>
             </w:r>
           </w:p>
         </w:tc>
@@ -2947,18 +2855,22 @@
           <w:tcPr/>
           <w:p>
             <w:pPr>
-              <w:jc w:val="center"/>
-              <w:rPr>
-                <w:b w:val="1"/>
-                <w:bCs w:val="1"/>
-                <w:sz w:val="18"/>
-                <w:szCs w:val="18"/>
-              </w:rPr>
-            </w:pPr>
-            <w:r>
-              <w:rPr>
-                <w:rtl w:val="0"/>
-              </w:rPr>
+              <w:rPr>
+                <w:b w:val="1"/>
+                <w:bCs w:val="1"/>
+                <w:sz w:val="18"/>
+                <w:szCs w:val="18"/>
+              </w:rPr>
+            </w:pPr>
+            <w:r>
+              <w:rPr>
+                <w:b w:val="1"/>
+                <w:bCs w:val="1"/>
+                <w:sz w:val="18"/>
+                <w:szCs w:val="18"/>
+                <w:rtl w:val="0"/>
+              </w:rPr>
+              <w:t xml:space="preserve">Me siento capacitada para evaluar y gestionar proyectos, pero creo que puedo seguir mejorando en el uso de las distintas herramientas de software.</w:t>
             </w:r>
           </w:p>
         </w:tc>
@@ -2973,10 +2885,33 @@
           <w:tcPr/>
           <w:p>
             <w:pPr>
+              <w:pBdr>
+                <w:top w:color="auto" w:space="7" w:sz="0" w:val="none"/>
+                <w:bottom w:color="auto" w:space="7" w:sz="0" w:val="none"/>
+                <w:right w:color="auto" w:space="7" w:sz="0" w:val="none"/>
+                <w:between w:color="auto" w:space="7" w:sz="0" w:val="none"/>
+              </w:pBdr>
+              <w:shd w:fill="ffffff" w:val="clear"/>
+              <w:spacing w:before="180" w:lineRule="auto"/>
+              <w:ind w:left="0" w:firstLine="0"/>
+              <w:rPr>
+                <w:sz w:val="18"/>
+                <w:szCs w:val="18"/>
+              </w:rPr>
+            </w:pPr>
+            <w:r>
+              <w:rPr>
+                <w:sz w:val="18"/>
+                <w:szCs w:val="18"/>
+                <w:rtl w:val="0"/>
+              </w:rPr>
+              <w:t xml:space="preserve">Diseñar soluciones de software, abarcando todo el ciclo de vida de éste, de acuerdo a estándares, marcos de trabajo y regulatorios, tecnologías y metodologías que promueven la innovación, con foco en la calidad, seguridad y sostenibilidad del proyecto.</w:t>
+            </w:r>
+          </w:p>
+          <w:p>
+            <w:pPr>
               <w:jc w:val="center"/>
               <w:rPr>
-                <w:b w:val="1"/>
-                <w:bCs w:val="1"/>
                 <w:sz w:val="18"/>
                 <w:szCs w:val="18"/>
               </w:rPr>
@@ -3021,8 +2956,13 @@
             </w:pPr>
             <w:r>
               <w:rPr>
-                <w:rtl w:val="0"/>
-              </w:rPr>
+                <w:b w:val="1"/>
+                <w:bCs w:val="1"/>
+                <w:sz w:val="18"/>
+                <w:szCs w:val="18"/>
+                <w:rtl w:val="0"/>
+              </w:rPr>
+              <w:t xml:space="preserve">X</w:t>
             </w:r>
           </w:p>
         </w:tc>
@@ -3087,18 +3027,22 @@
           <w:tcPr/>
           <w:p>
             <w:pPr>
-              <w:jc w:val="center"/>
-              <w:rPr>
-                <w:b w:val="1"/>
-                <w:bCs w:val="1"/>
-                <w:sz w:val="18"/>
-                <w:szCs w:val="18"/>
-              </w:rPr>
-            </w:pPr>
-            <w:r>
-              <w:rPr>
-                <w:rtl w:val="0"/>
-              </w:rPr>
+              <w:rPr>
+                <w:b w:val="1"/>
+                <w:bCs w:val="1"/>
+                <w:sz w:val="18"/>
+                <w:szCs w:val="18"/>
+              </w:rPr>
+            </w:pPr>
+            <w:r>
+              <w:rPr>
+                <w:b w:val="1"/>
+                <w:bCs w:val="1"/>
+                <w:sz w:val="18"/>
+                <w:szCs w:val="18"/>
+                <w:rtl w:val="0"/>
+              </w:rPr>
+              <w:t xml:space="preserve">Siento que mis conocimientos relacionados al área del diseño de soluciones, pensando en la innovación , calidad y seguridad son de alto dominio ya que lo he puesto en práctica en distintos proyectos durante este año, teniendo buenos feedback y oportunidades de mejora.</w:t>
             </w:r>
           </w:p>
         </w:tc>
@@ -3113,10 +3057,33 @@
           <w:tcPr/>
           <w:p>
             <w:pPr>
+              <w:pBdr>
+                <w:top w:color="auto" w:space="7" w:sz="0" w:val="none"/>
+                <w:bottom w:color="auto" w:space="7" w:sz="0" w:val="none"/>
+                <w:right w:color="auto" w:space="7" w:sz="0" w:val="none"/>
+                <w:between w:color="auto" w:space="7" w:sz="0" w:val="none"/>
+              </w:pBdr>
+              <w:shd w:fill="ffffff" w:val="clear"/>
+              <w:spacing w:before="180" w:lineRule="auto"/>
+              <w:ind w:left="0" w:firstLine="0"/>
+              <w:rPr>
+                <w:sz w:val="18"/>
+                <w:szCs w:val="18"/>
+              </w:rPr>
+            </w:pPr>
+            <w:r>
+              <w:rPr>
+                <w:sz w:val="18"/>
+                <w:szCs w:val="18"/>
+                <w:rtl w:val="0"/>
+              </w:rPr>
+              <w:t xml:space="preserve">Desarrollar proyectos de software innovadores para plataformas y dispositivos móviles, por medio de marcos de trabajo, herramientas de desarrollo, lenguajes de programación y buenas prácticas de la industria del desarrollo de software.</w:t>
+            </w:r>
+          </w:p>
+          <w:p>
+            <w:pPr>
               <w:jc w:val="center"/>
               <w:rPr>
-                <w:b w:val="1"/>
-                <w:bCs w:val="1"/>
                 <w:sz w:val="18"/>
                 <w:szCs w:val="18"/>
               </w:rPr>
@@ -3180,8 +3147,13 @@
             </w:pPr>
             <w:r>
               <w:rPr>
-                <w:rtl w:val="0"/>
-              </w:rPr>
+                <w:b w:val="1"/>
+                <w:bCs w:val="1"/>
+                <w:sz w:val="18"/>
+                <w:szCs w:val="18"/>
+                <w:rtl w:val="0"/>
+              </w:rPr>
+              <w:t xml:space="preserve">X</w:t>
             </w:r>
           </w:p>
         </w:tc>
@@ -3227,298 +3199,22 @@
           <w:tcPr/>
           <w:p>
             <w:pPr>
-              <w:jc w:val="center"/>
-              <w:rPr>
-                <w:b w:val="1"/>
-                <w:bCs w:val="1"/>
-                <w:sz w:val="18"/>
-                <w:szCs w:val="18"/>
-              </w:rPr>
-            </w:pPr>
-            <w:r>
-              <w:rPr>
-                <w:rtl w:val="0"/>
-              </w:rPr>
-            </w:r>
-          </w:p>
-        </w:tc>
-      </w:tr>
-      <w:tr>
-        <w:trPr>
-          <w:cantSplit w:val="0"/>
-          <w:trHeight w:val="591" w:hRule="atLeast"/>
-          <w:tblHeader w:val="0"/>
-        </w:trPr>
-        <w:tc>
-          <w:tcPr/>
-          <w:p>
-            <w:pPr>
-              <w:jc w:val="center"/>
-              <w:rPr>
-                <w:b w:val="1"/>
-                <w:bCs w:val="1"/>
-                <w:sz w:val="18"/>
-                <w:szCs w:val="18"/>
-              </w:rPr>
-            </w:pPr>
-            <w:r>
-              <w:rPr>
-                <w:rtl w:val="0"/>
-              </w:rPr>
-            </w:r>
-          </w:p>
-        </w:tc>
-        <w:tc>
-          <w:tcPr/>
-          <w:p>
-            <w:pPr>
-              <w:jc w:val="center"/>
-              <w:rPr>
-                <w:b w:val="1"/>
-                <w:bCs w:val="1"/>
-                <w:sz w:val="18"/>
-                <w:szCs w:val="18"/>
-              </w:rPr>
-            </w:pPr>
-            <w:r>
-              <w:rPr>
-                <w:rtl w:val="0"/>
-              </w:rPr>
-            </w:r>
-          </w:p>
-        </w:tc>
-        <w:tc>
-          <w:tcPr/>
-          <w:p>
-            <w:pPr>
-              <w:jc w:val="center"/>
-              <w:rPr>
-                <w:b w:val="1"/>
-                <w:bCs w:val="1"/>
-                <w:sz w:val="18"/>
-                <w:szCs w:val="18"/>
-              </w:rPr>
-            </w:pPr>
-            <w:r>
-              <w:rPr>
-                <w:rtl w:val="0"/>
-              </w:rPr>
-            </w:r>
-          </w:p>
-        </w:tc>
-        <w:tc>
-          <w:tcPr/>
-          <w:p>
-            <w:pPr>
-              <w:jc w:val="center"/>
-              <w:rPr>
-                <w:b w:val="1"/>
-                <w:bCs w:val="1"/>
-                <w:sz w:val="18"/>
-                <w:szCs w:val="18"/>
-              </w:rPr>
-            </w:pPr>
-            <w:r>
-              <w:rPr>
-                <w:rtl w:val="0"/>
-              </w:rPr>
-            </w:r>
-          </w:p>
-        </w:tc>
-        <w:tc>
-          <w:tcPr/>
-          <w:p>
-            <w:pPr>
-              <w:jc w:val="center"/>
-              <w:rPr>
-                <w:b w:val="1"/>
-                <w:bCs w:val="1"/>
-                <w:sz w:val="18"/>
-                <w:szCs w:val="18"/>
-              </w:rPr>
-            </w:pPr>
-            <w:r>
-              <w:rPr>
-                <w:rtl w:val="0"/>
-              </w:rPr>
-            </w:r>
-          </w:p>
-        </w:tc>
-        <w:tc>
-          <w:tcPr/>
-          <w:p>
-            <w:pPr>
-              <w:jc w:val="center"/>
-              <w:rPr>
-                <w:b w:val="1"/>
-                <w:bCs w:val="1"/>
-                <w:sz w:val="18"/>
-                <w:szCs w:val="18"/>
-              </w:rPr>
-            </w:pPr>
-            <w:r>
-              <w:rPr>
-                <w:rtl w:val="0"/>
-              </w:rPr>
-            </w:r>
-          </w:p>
-        </w:tc>
-        <w:tc>
-          <w:tcPr/>
-          <w:p>
-            <w:pPr>
-              <w:jc w:val="center"/>
-              <w:rPr>
-                <w:b w:val="1"/>
-                <w:bCs w:val="1"/>
-                <w:sz w:val="18"/>
-                <w:szCs w:val="18"/>
-              </w:rPr>
-            </w:pPr>
-            <w:r>
-              <w:rPr>
-                <w:rtl w:val="0"/>
-              </w:rPr>
-            </w:r>
-          </w:p>
-        </w:tc>
-      </w:tr>
-      <w:tr>
-        <w:trPr>
-          <w:cantSplit w:val="0"/>
-          <w:trHeight w:val="576" w:hRule="atLeast"/>
-          <w:tblHeader w:val="0"/>
-        </w:trPr>
-        <w:tc>
-          <w:tcPr/>
-          <w:p>
-            <w:pPr>
-              <w:jc w:val="center"/>
-              <w:rPr>
-                <w:b w:val="1"/>
-                <w:bCs w:val="1"/>
-                <w:sz w:val="18"/>
-                <w:szCs w:val="18"/>
-              </w:rPr>
-            </w:pPr>
-            <w:r>
-              <w:rPr>
-                <w:rtl w:val="0"/>
-              </w:rPr>
-            </w:r>
-          </w:p>
-        </w:tc>
-        <w:tc>
-          <w:tcPr/>
-          <w:p>
-            <w:pPr>
-              <w:jc w:val="center"/>
-              <w:rPr>
-                <w:b w:val="1"/>
-                <w:bCs w:val="1"/>
-                <w:sz w:val="18"/>
-                <w:szCs w:val="18"/>
-              </w:rPr>
-            </w:pPr>
-            <w:r>
-              <w:rPr>
-                <w:rtl w:val="0"/>
-              </w:rPr>
-            </w:r>
-          </w:p>
-        </w:tc>
-        <w:tc>
-          <w:tcPr/>
-          <w:p>
-            <w:pPr>
-              <w:jc w:val="center"/>
-              <w:rPr>
-                <w:b w:val="1"/>
-                <w:bCs w:val="1"/>
-                <w:sz w:val="18"/>
-                <w:szCs w:val="18"/>
-              </w:rPr>
-            </w:pPr>
-            <w:r>
-              <w:rPr>
-                <w:rtl w:val="0"/>
-              </w:rPr>
-            </w:r>
-          </w:p>
-        </w:tc>
-        <w:tc>
-          <w:tcPr/>
-          <w:p>
-            <w:pPr>
-              <w:jc w:val="center"/>
-              <w:rPr>
-                <w:b w:val="1"/>
-                <w:bCs w:val="1"/>
-                <w:sz w:val="18"/>
-                <w:szCs w:val="18"/>
-              </w:rPr>
-            </w:pPr>
-            <w:r>
-              <w:rPr>
-                <w:rtl w:val="0"/>
-              </w:rPr>
-            </w:r>
-          </w:p>
-        </w:tc>
-        <w:tc>
-          <w:tcPr/>
-          <w:p>
-            <w:pPr>
-              <w:jc w:val="center"/>
-              <w:rPr>
-                <w:b w:val="1"/>
-                <w:bCs w:val="1"/>
-                <w:sz w:val="18"/>
-                <w:szCs w:val="18"/>
-              </w:rPr>
-            </w:pPr>
-            <w:r>
-              <w:rPr>
-                <w:rtl w:val="0"/>
-              </w:rPr>
-            </w:r>
-          </w:p>
-        </w:tc>
-        <w:tc>
-          <w:tcPr/>
-          <w:p>
-            <w:pPr>
-              <w:jc w:val="center"/>
-              <w:rPr>
-                <w:b w:val="1"/>
-                <w:bCs w:val="1"/>
-                <w:sz w:val="18"/>
-                <w:szCs w:val="18"/>
-              </w:rPr>
-            </w:pPr>
-            <w:r>
-              <w:rPr>
-                <w:rtl w:val="0"/>
-              </w:rPr>
-            </w:r>
-          </w:p>
-        </w:tc>
-        <w:tc>
-          <w:tcPr/>
-          <w:p>
-            <w:pPr>
-              <w:jc w:val="center"/>
-              <w:rPr>
-                <w:b w:val="1"/>
-                <w:bCs w:val="1"/>
-                <w:sz w:val="18"/>
-                <w:szCs w:val="18"/>
-              </w:rPr>
-            </w:pPr>
-            <w:r>
-              <w:rPr>
-                <w:rtl w:val="0"/>
-              </w:rPr>
+              <w:rPr>
+                <w:b w:val="1"/>
+                <w:bCs w:val="1"/>
+                <w:sz w:val="18"/>
+                <w:szCs w:val="18"/>
+              </w:rPr>
+            </w:pPr>
+            <w:r>
+              <w:rPr>
+                <w:b w:val="1"/>
+                <w:bCs w:val="1"/>
+                <w:sz w:val="18"/>
+                <w:szCs w:val="18"/>
+                <w:rtl w:val="0"/>
+              </w:rPr>
+              <w:t xml:space="preserve">Actualmente siento que mis conocimientos y dominio en desarrollar o programar aplicaciones no es mi fuerte, hace mucho tiempo que no me dedico al área del desarrollo por lo que desconozco las buenas prácticas y herramientas actuales dentro de la industria.</w:t>
             </w:r>
           </w:p>
         </w:tc>
@@ -3542,19 +3238,10 @@
         <w:ind w:left="435" w:right="0" w:firstLine="0"/>
         <w:jc w:val="left"/>
         <w:rPr>
-          <w:rFonts w:ascii="Calibri" w:cs="Calibri" w:eastAsia="Calibri" w:hAnsi="Calibri"/>
-          <w:b w:val="0"/>
-          <w:bCs w:val="0"/>
-          <w:i w:val="0"/>
-          <w:iCs w:val="0"/>
-          <w:smallCaps w:val="0"/>
-          <w:strike w:val="0"/>
-          <w:color w:val="000000"/>
-          <w:sz w:val="20"/>
-          <w:szCs w:val="20"/>
-          <w:u w:val="none"/>
-          <w:shd w:fill="auto" w:val="clear"/>
-          <w:vertAlign w:val="baseline"/>
+          <w:b w:val="1"/>
+          <w:bCs w:val="1"/>
+          <w:sz w:val="18"/>
+          <w:szCs w:val="18"/>
         </w:rPr>
       </w:pPr>
       <w:r>
@@ -4173,12 +3860,12 @@
               <wp:inline distB="0" distT="0" distL="0" distR="0">
                 <wp:extent cx="1996440" cy="428625"/>
                 <wp:effectExtent b="0" l="0" r="0" t="0"/>
-                <wp:docPr descr="http://www.duoc.cl/normasgraficas/normasgraficas/marca-duoc/6logo-fondo-transparente/fondo-transparente.png" id="2" name="image2.png"/>
+                <wp:docPr descr="http://www.duoc.cl/normasgraficas/normasgraficas/marca-duoc/6logo-fondo-transparente/fondo-transparente.png" id="2" name="image1.png"/>
                 <a:graphic>
                   <a:graphicData uri="http://schemas.openxmlformats.org/drawingml/2006/picture">
                     <pic:pic>
                       <pic:nvPicPr>
-                        <pic:cNvPr descr="http://www.duoc.cl/normasgraficas/normasgraficas/marca-duoc/6logo-fondo-transparente/fondo-transparente.png" id="0" name="image2.png"/>
+                        <pic:cNvPr descr="http://www.duoc.cl/normasgraficas/normasgraficas/marca-duoc/6logo-fondo-transparente/fondo-transparente.png" id="0" name="image1.png"/>
                         <pic:cNvPicPr preferRelativeResize="0"/>
                       </pic:nvPicPr>
                       <pic:blipFill>
@@ -4363,12 +4050,12 @@
               <wp:inline distB="0" distT="0" distL="0" distR="0">
                 <wp:extent cx="363448" cy="578253"/>
                 <wp:effectExtent b="0" l="0" r="0" t="0"/>
-                <wp:docPr id="4" name="image3.png"/>
+                <wp:docPr id="4" name="image2.png"/>
                 <a:graphic>
                   <a:graphicData uri="http://schemas.openxmlformats.org/drawingml/2006/picture">
                     <pic:pic>
                       <pic:nvPicPr>
-                        <pic:cNvPr id="0" name="image3.png"/>
+                        <pic:cNvPr id="0" name="image2.png"/>
                         <pic:cNvPicPr preferRelativeResize="0"/>
                       </pic:nvPicPr>
                       <pic:blipFill>
@@ -4519,12 +4206,12 @@
               <wp:inline distB="0" distT="0" distL="0" distR="0">
                 <wp:extent cx="1908834" cy="470407"/>
                 <wp:effectExtent b="0" l="0" r="0" t="0"/>
-                <wp:docPr id="3" name="image1.png"/>
+                <wp:docPr id="3" name="image3.png"/>
                 <a:graphic>
                   <a:graphicData uri="http://schemas.openxmlformats.org/drawingml/2006/picture">
                     <pic:pic>
                       <pic:nvPicPr>
-                        <pic:cNvPr id="0" name="image1.png"/>
+                        <pic:cNvPr id="0" name="image3.png"/>
                         <pic:cNvPicPr preferRelativeResize="0"/>
                       </pic:nvPicPr>
                       <pic:blipFill>

</xml_diff>

<commit_message>
SE SUBEN ARCHIVOS 1.1 Y 1.2 LISTOS SE SUBEN MAS ARCHIVOS PARA PODER ENVIAR LA EVIDENCIA CON LA ESTRUCTURA DEL GIT
</commit_message>
<xml_diff>
--- a/Fase 1/Evidencias Individuales/Pino_Joselyn_1.1_APT122_AutoevaluacionCompetenciasFase1.docx
+++ b/Fase 1/Evidencias Individuales/Pino_Joselyn_1.1_APT122_AutoevaluacionCompetenciasFase1.docx
@@ -3860,12 +3860,12 @@
               <wp:inline distB="0" distT="0" distL="0" distR="0">
                 <wp:extent cx="1996440" cy="428625"/>
                 <wp:effectExtent b="0" l="0" r="0" t="0"/>
-                <wp:docPr descr="http://www.duoc.cl/normasgraficas/normasgraficas/marca-duoc/6logo-fondo-transparente/fondo-transparente.png" id="2" name="image1.png"/>
+                <wp:docPr descr="http://www.duoc.cl/normasgraficas/normasgraficas/marca-duoc/6logo-fondo-transparente/fondo-transparente.png" id="2" name="image2.png"/>
                 <a:graphic>
                   <a:graphicData uri="http://schemas.openxmlformats.org/drawingml/2006/picture">
                     <pic:pic>
                       <pic:nvPicPr>
-                        <pic:cNvPr descr="http://www.duoc.cl/normasgraficas/normasgraficas/marca-duoc/6logo-fondo-transparente/fondo-transparente.png" id="0" name="image1.png"/>
+                        <pic:cNvPr descr="http://www.duoc.cl/normasgraficas/normasgraficas/marca-duoc/6logo-fondo-transparente/fondo-transparente.png" id="0" name="image2.png"/>
                         <pic:cNvPicPr preferRelativeResize="0"/>
                       </pic:nvPicPr>
                       <pic:blipFill>
@@ -4050,12 +4050,12 @@
               <wp:inline distB="0" distT="0" distL="0" distR="0">
                 <wp:extent cx="363448" cy="578253"/>
                 <wp:effectExtent b="0" l="0" r="0" t="0"/>
-                <wp:docPr id="4" name="image2.png"/>
+                <wp:docPr id="4" name="image1.png"/>
                 <a:graphic>
                   <a:graphicData uri="http://schemas.openxmlformats.org/drawingml/2006/picture">
                     <pic:pic>
                       <pic:nvPicPr>
-                        <pic:cNvPr id="0" name="image2.png"/>
+                        <pic:cNvPr id="0" name="image1.png"/>
                         <pic:cNvPicPr preferRelativeResize="0"/>
                       </pic:nvPicPr>
                       <pic:blipFill>

</xml_diff>